<commit_message>
docs(REP-2500): propuesta v1.2 - comparacion Google vs Nominatim para O-2
Leo y Hernan confirmaron en Jira la secuencia de dos fases (Opcion 1
ahora, Opcion 4 como deuda tecnica), pero proponen proveedores
distintos para la Fase 2. Se agrega una comparacion con evidencia
(precio oficial de Google Maps Platform verificado: 10.000
solicitudes/mes gratis) y se recomienda Google Geocoding por precision
de barrio en Argentina y por reusar la misma alerta de presupuesto que
ya se necesita para Gemini (V-08).

Co-Authored-By: Claude Sonnet 5 <noreply@anthropic.com>
</commit_message>
<xml_diff>
--- a/docs/REP-2500_propuesta-fases-localidad.docx
+++ b/docs/REP-2500_propuesta-fases-localidad.docx
@@ -56,7 +56,7 @@
           <w:sz w:val="20"/>
           <w:szCs w:val="20"/>
         </w:rPr>
-        <w:t xml:space="preserve">Versión 1.0 · 15 de septiembre de 2026 · Construcción · Proyecto RAR-2026</w:t>
+        <w:t xml:space="preserve">Versión 1.2 · 15 de septiembre de 2026 · Construcción · Proyecto RAR-2026</w:t>
       </w:r>
     </w:p>
     <w:p>
@@ -72,7 +72,7 @@
         </w:rPr>
         <w:t xml:space="preserve">Responde a: </w:t>
       </w:r>
-      <w:hyperlink w:history="1" r:id="rIduo-d4imrzbxsfjxriny7q">
+      <w:hyperlink w:history="1" r:id="rId6rtmc7qbpjzkjyja340be">
         <w:r>
           <w:rPr>
             <w:rStyle w:val="Hyperlink"/>
@@ -87,7 +87,7 @@
           <w:sz w:val="20"/>
           <w:szCs w:val="20"/>
         </w:rPr>
-        <w:t xml:space="preserve"> y a la devolución de Leo — Hernán de acuerdo.</w:t>
+        <w:t xml:space="preserve"> y a la devolución de Leo y Hernán en Jira (15/09) — ver §5 sobre el proveedor de geocoding.</w:t>
       </w:r>
     </w:p>
     <w:p>
@@ -103,7 +103,7 @@
         </w:rPr>
         <w:t xml:space="preserve">Jira: </w:t>
       </w:r>
-      <w:hyperlink w:history="1" r:id="rIdh6mh87twtxshlm1ymadth">
+      <w:hyperlink w:history="1" r:id="rIdrazwa8ixr25oxt8lt8m0o">
         <w:r>
           <w:rPr>
             <w:rStyle w:val="Hyperlink"/>
@@ -184,7 +184,7 @@
           <w:sz w:val="21"/>
           <w:szCs w:val="21"/>
         </w:rPr>
-        <w:t xml:space="preserve">Responder a la propuesta de Leo (Opción 4 automática con Opción 1 como contingencia) con un análisis técnico y una recomendación de cómo secuenciarla, antes de empezar a implementar.</w:t>
+        <w:t xml:space="preserve">Responder a la propuesta de Leo (Opción 4 automática con Opción 1 como contingencia) con un análisis técnico, y resolver con evidencia la discusión abierta entre Leo y Hernán sobre qué proveedor de geocoding usar en la Fase 2.</w:t>
       </w:r>
     </w:p>
     <w:p>
@@ -229,7 +229,7 @@
           <w:sz w:val="21"/>
           <w:szCs w:val="21"/>
         </w:rPr>
-        <w:t xml:space="preserve">El patrón es correcto — automático primero, con un camino manual de respaldo, es justo lo que evita que el ciudadano quede trabado si una API externa falla. El punto de este documento no es objetar la idea, sino señalar que combina dos piezas de tamaño muy distinto y proponer cómo secuenciarlas.</w:t>
+        <w:t xml:space="preserve">El patrón es correcto — automático primero, con un camino manual de respaldo, es justo lo que evita que el ciudadano quede trabado si una API externa falla.</w:t>
       </w:r>
     </w:p>
     <w:p>
@@ -243,14 +243,79 @@
     </w:p>
     <w:p>
       <w:pPr>
-        <w:spacing w:after="150"/>
-      </w:pPr>
-      <w:r>
-        <w:rPr>
-          <w:sz w:val="21"/>
-          <w:szCs w:val="21"/>
-        </w:rPr>
-        <w:t xml:space="preserve">Combinar las dos opciones trae de vuelta todo el tamaño de la Opción 4 (que en el documento anterior se había dejado fuera de alcance de REP-2500 precisamente por su tamaño). Implementar el reverse-geocoding real implica tres piezas nuevas, ninguna trivial:</w:t>
+        <w:pStyle w:val="ListParagraph"/>
+        <w:numPr>
+          <w:ilvl w:val="0"/>
+          <w:numId w:val="2"/>
+        </w:numPr>
+        <w:spacing w:after="70"/>
+      </w:pPr>
+      <w:r>
+        <w:rPr>
+          <w:sz w:val="21"/>
+          <w:szCs w:val="21"/>
+        </w:rPr>
+        <w:t xml:space="preserve">Elegir un proveedor externo — ver comparación en §5.</w:t>
+      </w:r>
+    </w:p>
+    <w:p>
+      <w:pPr>
+        <w:pStyle w:val="ListParagraph"/>
+        <w:numPr>
+          <w:ilvl w:val="0"/>
+          <w:numId w:val="2"/>
+        </w:numPr>
+        <w:spacing w:after="70"/>
+      </w:pPr>
+      <w:r>
+        <w:rPr>
+          <w:sz w:val="21"/>
+          <w:szCs w:val="21"/>
+        </w:rPr>
+        <w:t xml:space="preserve">Matchear el resultado contra localities: el proveedor devuelve texto libre, no un id de la tabla.</w:t>
+      </w:r>
+    </w:p>
+    <w:p>
+      <w:pPr>
+        <w:pStyle w:val="ListParagraph"/>
+        <w:numPr>
+          <w:ilvl w:val="0"/>
+          <w:numId w:val="2"/>
+        </w:numPr>
+        <w:spacing w:after="70"/>
+      </w:pPr>
+      <w:r>
+        <w:rPr>
+          <w:sz w:val="21"/>
+          <w:szCs w:val="21"/>
+        </w:rPr>
+        <w:t xml:space="preserve">Ya hay un problema de datos: dos filas "Avellaneda" duplicadas en localities.</w:t>
+      </w:r>
+    </w:p>
+    <w:p>
+      <w:pPr>
+        <w:pStyle w:val="ListParagraph"/>
+        <w:numPr>
+          <w:ilvl w:val="0"/>
+          <w:numId w:val="2"/>
+        </w:numPr>
+        <w:spacing w:after="70"/>
+      </w:pPr>
+      <w:r>
+        <w:rPr>
+          <w:sz w:val="21"/>
+          <w:szCs w:val="21"/>
+        </w:rPr>
+        <w:t xml:space="preserve">Falta definir el criterio exacto de "cuándo cae al fallback".</w:t>
+      </w:r>
+    </w:p>
+    <w:p>
+      <w:pPr>
+        <w:pStyle w:val="Heading1"/>
+        <w:spacing w:after="120" w:before="260"/>
+      </w:pPr>
+      <w:r>
+        <w:t xml:space="preserve">3. Recomendación: dos fases, no una entrega</w:t>
       </w:r>
     </w:p>
     <w:p>
@@ -264,7 +329,111 @@
           <w:sz w:val="21"/>
           <w:szCs w:val="21"/>
         </w:rPr>
-        <w:t xml:space="preserve">a) Elegir un proveedor externo.</w:t>
+        <w:t xml:space="preserve">Fase 1 — REP-2500, Sprint 12 (ahora).</w:t>
+      </w:r>
+    </w:p>
+    <w:p>
+      <w:pPr>
+        <w:spacing w:after="150"/>
+      </w:pPr>
+      <w:r>
+        <w:rPr>
+          <w:sz w:val="21"/>
+          <w:szCs w:val="21"/>
+        </w:rPr>
+        <w:t xml:space="preserve">Selector manual (Opción 1) como única vía. Cierra el ticket sin depender de decisiones externas todavía pendientes.</w:t>
+      </w:r>
+    </w:p>
+    <w:p>
+      <w:pPr>
+        <w:spacing w:after="80" w:before="100"/>
+      </w:pPr>
+      <w:r>
+        <w:rPr>
+          <w:b/>
+          <w:bCs/>
+          <w:sz w:val="21"/>
+          <w:szCs w:val="21"/>
+        </w:rPr>
+        <w:t xml:space="preserve">Fase 2 — ticket aparte, sprint a definir.</w:t>
+      </w:r>
+    </w:p>
+    <w:p>
+      <w:pPr>
+        <w:spacing w:after="150"/>
+      </w:pPr>
+      <w:r>
+        <w:rPr>
+          <w:sz w:val="21"/>
+          <w:szCs w:val="21"/>
+        </w:rPr>
+        <w:t xml:space="preserve">Reverse-geocoding automático encima del selector: si falla o hay baja confianza, precarga el selector de la Fase 1 en vez de dejarlo vacío.</w:t>
+      </w:r>
+    </w:p>
+    <w:p>
+      <w:pPr>
+        <w:pBdr>
+          <w:left w:val="single" w:color="999999" w:sz="18" w:space="8"/>
+        </w:pBdr>
+        <w:spacing w:after="200"/>
+      </w:pPr>
+      <w:r>
+        <w:rPr>
+          <w:b/>
+          <w:bCs/>
+          <w:sz w:val="21"/>
+          <w:szCs w:val="21"/>
+        </w:rPr>
+        <w:t xml:space="preserve">Confirmado por Leo y Hernán (Jira, 15/09). </w:t>
+      </w:r>
+      <w:r>
+        <w:rPr>
+          <w:sz w:val="21"/>
+          <w:szCs w:val="21"/>
+        </w:rPr>
+        <w:t xml:space="preserve">Ambos coinciden con esta secuencia. La única diferencia entre sus mensajes es el proveedor: Leo propone Google Geocoding, Hernán propone OpenStreetMap/Nominatim. Se resuelve en §5.</w:t>
+      </w:r>
+    </w:p>
+    <w:p>
+      <w:pPr>
+        <w:pStyle w:val="Heading1"/>
+        <w:spacing w:after="120" w:before="260"/>
+      </w:pPr>
+      <w:r>
+        <w:t xml:space="preserve">4. Fuera de alcance de esta propuesta</w:t>
+      </w:r>
+    </w:p>
+    <w:p>
+      <w:pPr>
+        <w:spacing w:after="150"/>
+      </w:pPr>
+      <w:r>
+        <w:rPr>
+          <w:sz w:val="21"/>
+          <w:szCs w:val="21"/>
+        </w:rPr>
+        <w:t xml:space="preserve">Todo lo referido al frente RAG (V-01 a V-13) — Leo pidió explícitamente priorizar cerrar ese frente primero este sprint. Ver REP-2908-VERIF_devolucion-a-hernan.docx.</w:t>
+      </w:r>
+    </w:p>
+    <w:p>
+      <w:pPr>
+        <w:pStyle w:val="Heading1"/>
+        <w:spacing w:after="120" w:before="260"/>
+      </w:pPr>
+      <w:r>
+        <w:t xml:space="preserve">5. Google Geocoding vs. OpenStreetMap/Nominatim — comparación para resolver O-2</w:t>
+      </w:r>
+    </w:p>
+    <w:p>
+      <w:pPr>
+        <w:spacing w:after="150"/>
+      </w:pPr>
+      <w:r>
+        <w:rPr>
+          <w:sz w:val="21"/>
+          <w:szCs w:val="21"/>
+        </w:rPr>
+        <w:t xml:space="preserve">Leo cita la página oficial de precios de Google Maps Platform: la Geocoding API da 10.000 solicitudes gratis por mes, y recién a partir de la 10.001 cobra 5 USD por cada 1.000. Verificado contra la fuente: el número es correcto. Para el volumen de un MVP, sobra.</w:t>
       </w:r>
     </w:p>
     <w:tbl>
@@ -281,9 +450,8 @@
       </w:tblPr>
       <w:tblGrid>
         <w:gridCol w:w="2400"/>
-        <w:gridCol w:w="1800"/>
-        <w:gridCol w:w="2650"/>
-        <w:gridCol w:w="2500"/>
+        <w:gridCol w:w="3475"/>
+        <w:gridCol w:w="3475"/>
       </w:tblGrid>
       <w:tr>
         <w:tc>
@@ -305,13 +473,13 @@
                 <w:sz w:val="19"/>
                 <w:szCs w:val="19"/>
               </w:rPr>
-              <w:t xml:space="preserve">Proveedor</w:t>
-            </w:r>
-          </w:p>
-        </w:tc>
-        <w:tc>
-          <w:tcPr>
-            <w:tcW w:type="dxa" w:w="1800"/>
+              <w:t xml:space="preserve"/>
+            </w:r>
+          </w:p>
+        </w:tc>
+        <w:tc>
+          <w:tcPr>
+            <w:tcW w:type="dxa" w:w="3475"/>
             <w:shd w:fill="D9E2F3" w:val="clear"/>
             <w:tcMar>
               <w:top w:type="dxa" w:w="70"/>
@@ -328,13 +496,13 @@
                 <w:sz w:val="19"/>
                 <w:szCs w:val="19"/>
               </w:rPr>
-              <w:t xml:space="preserve">Costo</w:t>
-            </w:r>
-          </w:p>
-        </w:tc>
-        <w:tc>
-          <w:tcPr>
-            <w:tcW w:type="dxa" w:w="2650"/>
+              <w:t xml:space="preserve">Google Geocoding API</w:t>
+            </w:r>
+          </w:p>
+        </w:tc>
+        <w:tc>
+          <w:tcPr>
+            <w:tcW w:type="dxa" w:w="3475"/>
             <w:shd w:fill="D9E2F3" w:val="clear"/>
             <w:tcMar>
               <w:top w:type="dxa" w:w="70"/>
@@ -351,30 +519,7 @@
                 <w:sz w:val="19"/>
                 <w:szCs w:val="19"/>
               </w:rPr>
-              <w:t xml:space="preserve">Precisión en Argentina</w:t>
-            </w:r>
-          </w:p>
-        </w:tc>
-        <w:tc>
-          <w:tcPr>
-            <w:tcW w:type="dxa" w:w="2500"/>
-            <w:shd w:fill="D9E2F3" w:val="clear"/>
-            <w:tcMar>
-              <w:top w:type="dxa" w:w="70"/>
-              <w:left w:type="dxa" w:w="90"/>
-              <w:bottom w:type="dxa" w:w="70"/>
-              <w:right w:type="dxa" w:w="90"/>
-            </w:tcMar>
-          </w:tcPr>
-          <w:p>
-            <w:r>
-              <w:rPr>
-                <w:b/>
-                <w:bCs/>
-                <w:sz w:val="19"/>
-                <w:szCs w:val="19"/>
-              </w:rPr>
-              <w:t xml:space="preserve">Límite de uso</w:t>
+              <w:t xml:space="preserve">OpenStreetMap / Nominatim</w:t>
             </w:r>
           </w:p>
         </w:tc>
@@ -398,73 +543,51 @@
                 <w:sz w:val="19"/>
                 <w:szCs w:val="19"/>
               </w:rPr>
-              <w:t xml:space="preserve">Google Geocoding API</w:t>
-            </w:r>
-          </w:p>
-        </w:tc>
-        <w:tc>
-          <w:tcPr>
-            <w:tcW w:type="dxa" w:w="1800"/>
-            <w:tcMar>
-              <w:top w:type="dxa" w:w="70"/>
-              <w:left w:type="dxa" w:w="90"/>
-              <w:bottom w:type="dxa" w:w="70"/>
-              <w:right w:type="dxa" w:w="90"/>
-            </w:tcMar>
-          </w:tcPr>
-          <w:p>
-            <w:r>
-              <w:rPr>
-                <w:b w:val="false"/>
-                <w:bCs w:val="false"/>
-                <w:sz w:val="19"/>
-                <w:szCs w:val="19"/>
-              </w:rPr>
-              <w:t xml:space="preserve">Pago por request</w:t>
-            </w:r>
-          </w:p>
-        </w:tc>
-        <w:tc>
-          <w:tcPr>
-            <w:tcW w:type="dxa" w:w="2650"/>
-            <w:tcMar>
-              <w:top w:type="dxa" w:w="70"/>
-              <w:left w:type="dxa" w:w="90"/>
-              <w:bottom w:type="dxa" w:w="70"/>
-              <w:right w:type="dxa" w:w="90"/>
-            </w:tcMar>
-          </w:tcPr>
-          <w:p>
-            <w:r>
-              <w:rPr>
-                <w:b w:val="false"/>
-                <w:bCs w:val="false"/>
-                <w:sz w:val="19"/>
-                <w:szCs w:val="19"/>
-              </w:rPr>
-              <w:t xml:space="preserve">Alta</w:t>
-            </w:r>
-          </w:p>
-        </w:tc>
-        <w:tc>
-          <w:tcPr>
-            <w:tcW w:type="dxa" w:w="2500"/>
-            <w:tcMar>
-              <w:top w:type="dxa" w:w="70"/>
-              <w:left w:type="dxa" w:w="90"/>
-              <w:bottom w:type="dxa" w:w="70"/>
-              <w:right w:type="dxa" w:w="90"/>
-            </w:tcMar>
-          </w:tcPr>
-          <w:p>
-            <w:r>
-              <w:rPr>
-                <w:b w:val="false"/>
-                <w:bCs w:val="false"/>
-                <w:sz w:val="19"/>
-                <w:szCs w:val="19"/>
-              </w:rPr>
-              <w:t xml:space="preserve">Cuota configurable, requiere billing</w:t>
+              <w:t xml:space="preserve">Costo</w:t>
+            </w:r>
+          </w:p>
+        </w:tc>
+        <w:tc>
+          <w:tcPr>
+            <w:tcW w:type="dxa" w:w="3475"/>
+            <w:tcMar>
+              <w:top w:type="dxa" w:w="70"/>
+              <w:left w:type="dxa" w:w="90"/>
+              <w:bottom w:type="dxa" w:w="70"/>
+              <w:right w:type="dxa" w:w="90"/>
+            </w:tcMar>
+          </w:tcPr>
+          <w:p>
+            <w:r>
+              <w:rPr>
+                <w:b w:val="false"/>
+                <w:bCs w:val="false"/>
+                <w:sz w:val="19"/>
+                <w:szCs w:val="19"/>
+              </w:rPr>
+              <w:t xml:space="preserve">0 USD hasta 10.000/mes, luego 5 USD/1.000</w:t>
+            </w:r>
+          </w:p>
+        </w:tc>
+        <w:tc>
+          <w:tcPr>
+            <w:tcW w:type="dxa" w:w="3475"/>
+            <w:tcMar>
+              <w:top w:type="dxa" w:w="70"/>
+              <w:left w:type="dxa" w:w="90"/>
+              <w:bottom w:type="dxa" w:w="70"/>
+              <w:right w:type="dxa" w:w="90"/>
+            </w:tcMar>
+          </w:tcPr>
+          <w:p>
+            <w:r>
+              <w:rPr>
+                <w:b w:val="false"/>
+                <w:bCs w:val="false"/>
+                <w:sz w:val="19"/>
+                <w:szCs w:val="19"/>
+              </w:rPr>
+              <w:t xml:space="preserve">Gratis, sin techo de costo</w:t>
             </w:r>
           </w:p>
         </w:tc>
@@ -488,73 +611,323 @@
                 <w:sz w:val="19"/>
                 <w:szCs w:val="19"/>
               </w:rPr>
-              <w:t xml:space="preserve">Nominatim (OpenStreetMap)</w:t>
-            </w:r>
-          </w:p>
-        </w:tc>
-        <w:tc>
-          <w:tcPr>
-            <w:tcW w:type="dxa" w:w="1800"/>
-            <w:tcMar>
-              <w:top w:type="dxa" w:w="70"/>
-              <w:left w:type="dxa" w:w="90"/>
-              <w:bottom w:type="dxa" w:w="70"/>
-              <w:right w:type="dxa" w:w="90"/>
-            </w:tcMar>
-          </w:tcPr>
-          <w:p>
-            <w:r>
-              <w:rPr>
-                <w:b w:val="false"/>
-                <w:bCs w:val="false"/>
-                <w:sz w:val="19"/>
-                <w:szCs w:val="19"/>
-              </w:rPr>
-              <w:t xml:space="preserve">Gratis</w:t>
-            </w:r>
-          </w:p>
-        </w:tc>
-        <w:tc>
-          <w:tcPr>
-            <w:tcW w:type="dxa" w:w="2650"/>
-            <w:tcMar>
-              <w:top w:type="dxa" w:w="70"/>
-              <w:left w:type="dxa" w:w="90"/>
-              <w:bottom w:type="dxa" w:w="70"/>
-              <w:right w:type="dxa" w:w="90"/>
-            </w:tcMar>
-          </w:tcPr>
-          <w:p>
-            <w:r>
-              <w:rPr>
-                <w:b w:val="false"/>
-                <w:bCs w:val="false"/>
-                <w:sz w:val="19"/>
-                <w:szCs w:val="19"/>
-              </w:rPr>
-              <w:t xml:space="preserve">Media — puede fallar en CABA/Avellaneda</w:t>
-            </w:r>
-          </w:p>
-        </w:tc>
-        <w:tc>
-          <w:tcPr>
-            <w:tcW w:type="dxa" w:w="2500"/>
-            <w:tcMar>
-              <w:top w:type="dxa" w:w="70"/>
-              <w:left w:type="dxa" w:w="90"/>
-              <w:bottom w:type="dxa" w:w="70"/>
-              <w:right w:type="dxa" w:w="90"/>
-            </w:tcMar>
-          </w:tcPr>
-          <w:p>
-            <w:r>
-              <w:rPr>
-                <w:b w:val="false"/>
-                <w:bCs w:val="false"/>
-                <w:sz w:val="19"/>
-                <w:szCs w:val="19"/>
-              </w:rPr>
-              <w:t xml:space="preserve">1 request/segundo, sin SLA</w:t>
+              <w:t xml:space="preserve">Precisión de barrio (AR)</w:t>
+            </w:r>
+          </w:p>
+        </w:tc>
+        <w:tc>
+          <w:tcPr>
+            <w:tcW w:type="dxa" w:w="3475"/>
+            <w:tcMar>
+              <w:top w:type="dxa" w:w="70"/>
+              <w:left w:type="dxa" w:w="90"/>
+              <w:bottom w:type="dxa" w:w="70"/>
+              <w:right w:type="dxa" w:w="90"/>
+            </w:tcMar>
+          </w:tcPr>
+          <w:p>
+            <w:r>
+              <w:rPr>
+                <w:b w:val="false"/>
+                <w:bCs w:val="false"/>
+                <w:sz w:val="19"/>
+                <w:szCs w:val="19"/>
+              </w:rPr>
+              <w:t xml:space="preserve">Alta — address_components estructurados</w:t>
+            </w:r>
+          </w:p>
+        </w:tc>
+        <w:tc>
+          <w:tcPr>
+            <w:tcW w:type="dxa" w:w="3475"/>
+            <w:tcMar>
+              <w:top w:type="dxa" w:w="70"/>
+              <w:left w:type="dxa" w:w="90"/>
+              <w:bottom w:type="dxa" w:w="70"/>
+              <w:right w:type="dxa" w:w="90"/>
+            </w:tcMar>
+          </w:tcPr>
+          <w:p>
+            <w:r>
+              <w:rPr>
+                <w:b w:val="false"/>
+                <w:bCs w:val="false"/>
+                <w:sz w:val="19"/>
+                <w:szCs w:val="19"/>
+              </w:rPr>
+              <w:t xml:space="preserve">Media — límites de barrio con huecos en CABA</w:t>
+            </w:r>
+          </w:p>
+        </w:tc>
+      </w:tr>
+      <w:tr>
+        <w:tc>
+          <w:tcPr>
+            <w:tcW w:type="dxa" w:w="2400"/>
+            <w:tcMar>
+              <w:top w:type="dxa" w:w="70"/>
+              <w:left w:type="dxa" w:w="90"/>
+              <w:bottom w:type="dxa" w:w="70"/>
+              <w:right w:type="dxa" w:w="90"/>
+            </w:tcMar>
+          </w:tcPr>
+          <w:p>
+            <w:r>
+              <w:rPr>
+                <w:b w:val="false"/>
+                <w:bCs w:val="false"/>
+                <w:sz w:val="19"/>
+                <w:szCs w:val="19"/>
+              </w:rPr>
+              <w:t xml:space="preserve">Límite de uso</w:t>
+            </w:r>
+          </w:p>
+        </w:tc>
+        <w:tc>
+          <w:tcPr>
+            <w:tcW w:type="dxa" w:w="3475"/>
+            <w:tcMar>
+              <w:top w:type="dxa" w:w="70"/>
+              <w:left w:type="dxa" w:w="90"/>
+              <w:bottom w:type="dxa" w:w="70"/>
+              <w:right w:type="dxa" w:w="90"/>
+            </w:tcMar>
+          </w:tcPr>
+          <w:p>
+            <w:r>
+              <w:rPr>
+                <w:b w:val="false"/>
+                <w:bCs w:val="false"/>
+                <w:sz w:val="19"/>
+                <w:szCs w:val="19"/>
+              </w:rPr>
+              <w:t xml:space="preserve">Cuota configurable por billing</w:t>
+            </w:r>
+          </w:p>
+        </w:tc>
+        <w:tc>
+          <w:tcPr>
+            <w:tcW w:type="dxa" w:w="3475"/>
+            <w:tcMar>
+              <w:top w:type="dxa" w:w="70"/>
+              <w:left w:type="dxa" w:w="90"/>
+              <w:bottom w:type="dxa" w:w="70"/>
+              <w:right w:type="dxa" w:w="90"/>
+            </w:tcMar>
+          </w:tcPr>
+          <w:p>
+            <w:r>
+              <w:rPr>
+                <w:b w:val="false"/>
+                <w:bCs w:val="false"/>
+                <w:sz w:val="19"/>
+                <w:szCs w:val="19"/>
+              </w:rPr>
+              <w:t xml:space="preserve">1 req/segundo (servidor público), sin SLA</w:t>
+            </w:r>
+          </w:p>
+        </w:tc>
+      </w:tr>
+      <w:tr>
+        <w:tc>
+          <w:tcPr>
+            <w:tcW w:type="dxa" w:w="2400"/>
+            <w:tcMar>
+              <w:top w:type="dxa" w:w="70"/>
+              <w:left w:type="dxa" w:w="90"/>
+              <w:bottom w:type="dxa" w:w="70"/>
+              <w:right w:type="dxa" w:w="90"/>
+            </w:tcMar>
+          </w:tcPr>
+          <w:p>
+            <w:r>
+              <w:rPr>
+                <w:b w:val="false"/>
+                <w:bCs w:val="false"/>
+                <w:sz w:val="19"/>
+                <w:szCs w:val="19"/>
+              </w:rPr>
+              <w:t xml:space="preserve">Infraestructura propia</w:t>
+            </w:r>
+          </w:p>
+        </w:tc>
+        <w:tc>
+          <w:tcPr>
+            <w:tcW w:type="dxa" w:w="3475"/>
+            <w:tcMar>
+              <w:top w:type="dxa" w:w="70"/>
+              <w:left w:type="dxa" w:w="90"/>
+              <w:bottom w:type="dxa" w:w="70"/>
+              <w:right w:type="dxa" w:w="90"/>
+            </w:tcMar>
+          </w:tcPr>
+          <w:p>
+            <w:r>
+              <w:rPr>
+                <w:b w:val="false"/>
+                <w:bCs w:val="false"/>
+                <w:sz w:val="19"/>
+                <w:szCs w:val="19"/>
+              </w:rPr>
+              <w:t xml:space="preserve">Ninguna — API administrada</w:t>
+            </w:r>
+          </w:p>
+        </w:tc>
+        <w:tc>
+          <w:tcPr>
+            <w:tcW w:type="dxa" w:w="3475"/>
+            <w:tcMar>
+              <w:top w:type="dxa" w:w="70"/>
+              <w:left w:type="dxa" w:w="90"/>
+              <w:bottom w:type="dxa" w:w="70"/>
+              <w:right w:type="dxa" w:w="90"/>
+            </w:tcMar>
+          </w:tcPr>
+          <w:p>
+            <w:r>
+              <w:rPr>
+                <w:b w:val="false"/>
+                <w:bCs w:val="false"/>
+                <w:sz w:val="19"/>
+                <w:szCs w:val="19"/>
+              </w:rPr>
+              <w:t xml:space="preserve">Auto-hosteo si se supera el uso razonable</w:t>
+            </w:r>
+          </w:p>
+        </w:tc>
+      </w:tr>
+      <w:tr>
+        <w:tc>
+          <w:tcPr>
+            <w:tcW w:type="dxa" w:w="2400"/>
+            <w:tcMar>
+              <w:top w:type="dxa" w:w="70"/>
+              <w:left w:type="dxa" w:w="90"/>
+              <w:bottom w:type="dxa" w:w="70"/>
+              <w:right w:type="dxa" w:w="90"/>
+            </w:tcMar>
+          </w:tcPr>
+          <w:p>
+            <w:r>
+              <w:rPr>
+                <w:b w:val="false"/>
+                <w:bCs w:val="false"/>
+                <w:sz w:val="19"/>
+                <w:szCs w:val="19"/>
+              </w:rPr>
+              <w:t xml:space="preserve">Requiere billing</w:t>
+            </w:r>
+          </w:p>
+        </w:tc>
+        <w:tc>
+          <w:tcPr>
+            <w:tcW w:type="dxa" w:w="3475"/>
+            <w:tcMar>
+              <w:top w:type="dxa" w:w="70"/>
+              <w:left w:type="dxa" w:w="90"/>
+              <w:bottom w:type="dxa" w:w="70"/>
+              <w:right w:type="dxa" w:w="90"/>
+            </w:tcMar>
+          </w:tcPr>
+          <w:p>
+            <w:r>
+              <w:rPr>
+                <w:b w:val="false"/>
+                <w:bCs w:val="false"/>
+                <w:sz w:val="19"/>
+                <w:szCs w:val="19"/>
+              </w:rPr>
+              <w:t xml:space="preserve">Sí (tarjeta cargada, aunque uso sea 0 USD)</w:t>
+            </w:r>
+          </w:p>
+        </w:tc>
+        <w:tc>
+          <w:tcPr>
+            <w:tcW w:type="dxa" w:w="3475"/>
+            <w:tcMar>
+              <w:top w:type="dxa" w:w="70"/>
+              <w:left w:type="dxa" w:w="90"/>
+              <w:bottom w:type="dxa" w:w="70"/>
+              <w:right w:type="dxa" w:w="90"/>
+            </w:tcMar>
+          </w:tcPr>
+          <w:p>
+            <w:r>
+              <w:rPr>
+                <w:b w:val="false"/>
+                <w:bCs w:val="false"/>
+                <w:sz w:val="19"/>
+                <w:szCs w:val="19"/>
+              </w:rPr>
+              <w:t xml:space="preserve">No</w:t>
+            </w:r>
+          </w:p>
+        </w:tc>
+      </w:tr>
+      <w:tr>
+        <w:tc>
+          <w:tcPr>
+            <w:tcW w:type="dxa" w:w="2400"/>
+            <w:tcMar>
+              <w:top w:type="dxa" w:w="70"/>
+              <w:left w:type="dxa" w:w="90"/>
+              <w:bottom w:type="dxa" w:w="70"/>
+              <w:right w:type="dxa" w:w="90"/>
+            </w:tcMar>
+          </w:tcPr>
+          <w:p>
+            <w:r>
+              <w:rPr>
+                <w:b w:val="false"/>
+                <w:bCs w:val="false"/>
+                <w:sz w:val="19"/>
+                <w:szCs w:val="19"/>
+              </w:rPr>
+              <w:t xml:space="preserve">SLA / soporte</w:t>
+            </w:r>
+          </w:p>
+        </w:tc>
+        <w:tc>
+          <w:tcPr>
+            <w:tcW w:type="dxa" w:w="3475"/>
+            <w:tcMar>
+              <w:top w:type="dxa" w:w="70"/>
+              <w:left w:type="dxa" w:w="90"/>
+              <w:bottom w:type="dxa" w:w="70"/>
+              <w:right w:type="dxa" w:w="90"/>
+            </w:tcMar>
+          </w:tcPr>
+          <w:p>
+            <w:r>
+              <w:rPr>
+                <w:b w:val="false"/>
+                <w:bCs w:val="false"/>
+                <w:sz w:val="19"/>
+                <w:szCs w:val="19"/>
+              </w:rPr>
+              <w:t xml:space="preserve">Sí</w:t>
+            </w:r>
+          </w:p>
+        </w:tc>
+        <w:tc>
+          <w:tcPr>
+            <w:tcW w:type="dxa" w:w="3475"/>
+            <w:tcMar>
+              <w:top w:type="dxa" w:w="70"/>
+              <w:left w:type="dxa" w:w="90"/>
+              <w:bottom w:type="dxa" w:w="70"/>
+              <w:right w:type="dxa" w:w="90"/>
+            </w:tcMar>
+          </w:tcPr>
+          <w:p>
+            <w:r>
+              <w:rPr>
+                <w:b w:val="false"/>
+                <w:bCs w:val="false"/>
+                <w:sz w:val="19"/>
+                <w:szCs w:val="19"/>
+              </w:rPr>
+              <w:t xml:space="preserve">No</w:t>
             </w:r>
           </w:p>
         </w:tc>
@@ -567,7 +940,10 @@
     </w:p>
     <w:p>
       <w:pPr>
-        <w:spacing w:after="80" w:before="100"/>
+        <w:pBdr>
+          <w:left w:val="single" w:color="999999" w:sz="18" w:space="8"/>
+        </w:pBdr>
+        <w:spacing w:after="200"/>
       </w:pPr>
       <w:r>
         <w:rPr>
@@ -576,7 +952,14 @@
           <w:sz w:val="21"/>
           <w:szCs w:val="21"/>
         </w:rPr>
-        <w:t xml:space="preserve">b) Matchear el resultado contra localities.</w:t>
+        <w:t xml:space="preserve">Recomendación: Google Geocoding API. </w:t>
+      </w:r>
+      <w:r>
+        <w:rPr>
+          <w:sz w:val="21"/>
+          <w:szCs w:val="21"/>
+        </w:rPr>
+        <w:t xml:space="preserve">Dos razones pesan más para este caso puntual: (1) la precisión de barrio es justo lo que necesitan — matchear contra localities es el punto débil de Nominatim en Argentina; (2) la cuenta de billing no es una superficie de riesgo nueva — ya van a necesitar una alerta de presupuesto en Google Cloud para Gemini (V-08), agregar la misma alerta para Geocoding es incremental.</w:t>
       </w:r>
     </w:p>
     <w:p>
@@ -588,21 +971,7 @@
           <w:sz w:val="21"/>
           <w:szCs w:val="21"/>
         </w:rPr>
-        <w:t xml:space="preserve">El proveedor devuelve texto libre (ej. "Palermo, Buenos Aires, Argentina"), no un id de la tabla. Hay que resolver ese texto contra los nombres reales — no es un lookup directo.</w:t>
-      </w:r>
-    </w:p>
-    <w:p>
-      <w:pPr>
-        <w:spacing w:after="80" w:before="100"/>
-      </w:pPr>
-      <w:r>
-        <w:rPr>
-          <w:b/>
-          <w:bCs/>
-          <w:sz w:val="21"/>
-          <w:szCs w:val="21"/>
-        </w:rPr>
-        <w:t xml:space="preserve">c) Ya hay un problema de datos que bloquea ese matching.</w:t>
+        <w:t xml:space="preserve">La contra de Nominatim (evitar depender de una cuenta de billing) es real, pero a cambio de peor precisión en el dato que más importa acá, y de un problema de infraestructura (auto-hosteo) que hoy no está en el radar del equipo.</w:t>
       </w:r>
     </w:p>
     <w:p>
@@ -614,33 +983,7 @@
           <w:sz w:val="21"/>
           <w:szCs w:val="21"/>
         </w:rPr>
-        <w:t xml:space="preserve">Existen dos filas "Avellaneda" duplicadas en localities (mismo nombre, misma subdivisión). Sin un criterio de desambiguación, el matching automático puede resolver a cualquiera de las dos sin control.</w:t>
-      </w:r>
-    </w:p>
-    <w:p>
-      <w:pPr>
-        <w:spacing w:after="80" w:before="100"/>
-      </w:pPr>
-      <w:r>
-        <w:rPr>
-          <w:b/>
-          <w:bCs/>
-          <w:sz w:val="21"/>
-          <w:szCs w:val="21"/>
-        </w:rPr>
-        <w:t xml:space="preserve">d) Falta definir "cuándo cae al fallback".</w:t>
-      </w:r>
-    </w:p>
-    <w:p>
-      <w:pPr>
-        <w:spacing w:after="150"/>
-      </w:pPr>
-      <w:r>
-        <w:rPr>
-          <w:sz w:val="21"/>
-          <w:szCs w:val="21"/>
-        </w:rPr>
-        <w:t xml:space="preserve">¿Solo si la API devuelve error? ¿También si devuelve algo pero con baja confianza? Es una decisión de producto, no una consecuencia automática de usar las dos opciones juntas.</w:t>
+        <w:t xml:space="preserve">Si de todos modos se prefiere evitar la dependencia de Google, la alternativa razonable no es Nominatim público, sino evaluar un proveedor de geocoding en Argentina/LATAM sin billing — pero eso es una investigación aparte, no algo para resolver en esta propuesta.</w:t>
       </w:r>
     </w:p>
     <w:p>
@@ -649,80 +992,7 @@
         <w:spacing w:after="120" w:before="260"/>
       </w:pPr>
       <w:r>
-        <w:t xml:space="preserve">3. Recomendación: dos fases, no una entrega</w:t>
-      </w:r>
-    </w:p>
-    <w:p>
-      <w:pPr>
-        <w:spacing w:after="80" w:before="100"/>
-      </w:pPr>
-      <w:r>
-        <w:rPr>
-          <w:b/>
-          <w:bCs/>
-          <w:sz w:val="21"/>
-          <w:szCs w:val="21"/>
-        </w:rPr>
-        <w:t xml:space="preserve">Fase 1 — REP-2500, Sprint 12 (ahora).</w:t>
-      </w:r>
-    </w:p>
-    <w:p>
-      <w:pPr>
-        <w:spacing w:after="150"/>
-      </w:pPr>
-      <w:r>
-        <w:rPr>
-          <w:sz w:val="21"/>
-          <w:szCs w:val="21"/>
-        </w:rPr>
-        <w:t xml:space="preserve">Implementar el selector manual (Opción 1) como única vía. Cierra el ticket sin depender de decisiones externas todavía pendientes. El ciudadano elige su localidad de una lista real; sin llamadas a servicios externos.</w:t>
-      </w:r>
-    </w:p>
-    <w:p>
-      <w:pPr>
-        <w:spacing w:after="80" w:before="100"/>
-      </w:pPr>
-      <w:r>
-        <w:rPr>
-          <w:b/>
-          <w:bCs/>
-          <w:sz w:val="21"/>
-          <w:szCs w:val="21"/>
-        </w:rPr>
-        <w:t xml:space="preserve">Fase 2 — ticket aparte, sprint a definir.</w:t>
-      </w:r>
-    </w:p>
-    <w:p>
-      <w:pPr>
-        <w:spacing w:after="150"/>
-      </w:pPr>
-      <w:r>
-        <w:rPr>
-          <w:sz w:val="21"/>
-          <w:szCs w:val="21"/>
-        </w:rPr>
-        <w:t xml:space="preserve">Agregar el reverse-geocoding automático (Opción 4) encima del selector ya existente: se intenta resolver la localidad automáticamente y, si falla o no hay confianza suficiente, se precarga el selector de la Fase 1 en vez de dejarlo vacío — el comportamiento que pidió Leo, construido sobre una base que ya funciona.</w:t>
-      </w:r>
-    </w:p>
-    <w:p>
-      <w:pPr>
-        <w:spacing w:after="150"/>
-      </w:pPr>
-      <w:r>
-        <w:rPr>
-          <w:sz w:val="21"/>
-          <w:szCs w:val="21"/>
-        </w:rPr>
-        <w:t xml:space="preserve">Antes de esa Fase 2 hace falta, como prerrequisito, corregir el duplicado de "Avellaneda" en localities (dato, no código) y decidir el proveedor.</w:t>
-      </w:r>
-    </w:p>
-    <w:p>
-      <w:pPr>
-        <w:pStyle w:val="Heading1"/>
-        <w:spacing w:after="120" w:before="260"/>
-      </w:pPr>
-      <w:r>
-        <w:t xml:space="preserve">4. Tabla de decisiones</w:t>
+        <w:t xml:space="preserve">6. Tabla de decisiones</w:t>
       </w:r>
     </w:p>
     <w:tbl>
@@ -738,14 +1008,14 @@
         </w:tblBorders>
       </w:tblPr>
       <w:tblGrid>
-        <w:gridCol w:w="900"/>
-        <w:gridCol w:w="5750"/>
-        <w:gridCol w:w="2700"/>
+        <w:gridCol w:w="700"/>
+        <w:gridCol w:w="5150"/>
+        <w:gridCol w:w="3500"/>
       </w:tblGrid>
       <w:tr>
         <w:tc>
           <w:tcPr>
-            <w:tcW w:type="dxa" w:w="900"/>
+            <w:tcW w:type="dxa" w:w="700"/>
             <w:shd w:fill="D9E2F3" w:val="clear"/>
             <w:tcMar>
               <w:top w:type="dxa" w:w="70"/>
@@ -768,7 +1038,7 @@
         </w:tc>
         <w:tc>
           <w:tcPr>
-            <w:tcW w:type="dxa" w:w="5750"/>
+            <w:tcW w:type="dxa" w:w="5150"/>
             <w:shd w:fill="D9E2F3" w:val="clear"/>
             <w:tcMar>
               <w:top w:type="dxa" w:w="70"/>
@@ -791,7 +1061,7 @@
         </w:tc>
         <w:tc>
           <w:tcPr>
-            <w:tcW w:type="dxa" w:w="2700"/>
+            <w:tcW w:type="dxa" w:w="3500"/>
             <w:shd w:fill="D9E2F3" w:val="clear"/>
             <w:tcMar>
               <w:top w:type="dxa" w:w="70"/>
@@ -808,7 +1078,7 @@
                 <w:sz w:val="19"/>
                 <w:szCs w:val="19"/>
               </w:rPr>
-              <w:t xml:space="preserve">A quién corresponde</w:t>
+              <w:t xml:space="preserve">Estado</w:t>
             </w:r>
           </w:p>
         </w:tc>
@@ -816,7 +1086,7 @@
       <w:tr>
         <w:tc>
           <w:tcPr>
-            <w:tcW w:type="dxa" w:w="900"/>
+            <w:tcW w:type="dxa" w:w="700"/>
             <w:tcMar>
               <w:top w:type="dxa" w:w="70"/>
               <w:left w:type="dxa" w:w="90"/>
@@ -838,45 +1108,46 @@
         </w:tc>
         <w:tc>
           <w:tcPr>
-            <w:tcW w:type="dxa" w:w="5750"/>
-            <w:tcMar>
-              <w:top w:type="dxa" w:w="70"/>
-              <w:left w:type="dxa" w:w="90"/>
-              <w:bottom w:type="dxa" w:w="70"/>
-              <w:right w:type="dxa" w:w="90"/>
-            </w:tcMar>
-          </w:tcPr>
-          <w:p>
-            <w:r>
-              <w:rPr>
-                <w:b w:val="false"/>
-                <w:bCs w:val="false"/>
-                <w:sz w:val="19"/>
-                <w:szCs w:val="19"/>
-              </w:rPr>
-              <w:t xml:space="preserve">Aprobar la secuencia en dos fases (selector ahora, geocoding + fallback después)</w:t>
-            </w:r>
-          </w:p>
-        </w:tc>
-        <w:tc>
-          <w:tcPr>
-            <w:tcW w:type="dxa" w:w="2700"/>
-            <w:tcMar>
-              <w:top w:type="dxa" w:w="70"/>
-              <w:left w:type="dxa" w:w="90"/>
-              <w:bottom w:type="dxa" w:w="70"/>
-              <w:right w:type="dxa" w:w="90"/>
-            </w:tcMar>
-          </w:tcPr>
-          <w:p>
-            <w:r>
-              <w:rPr>
-                <w:b w:val="false"/>
-                <w:bCs w:val="false"/>
-                <w:sz w:val="19"/>
-                <w:szCs w:val="19"/>
-              </w:rPr>
-              <w:t xml:space="preserve">Leonel Nuñez, Hernán Gregorini</w:t>
+            <w:tcW w:type="dxa" w:w="5150"/>
+            <w:tcMar>
+              <w:top w:type="dxa" w:w="70"/>
+              <w:left w:type="dxa" w:w="90"/>
+              <w:bottom w:type="dxa" w:w="70"/>
+              <w:right w:type="dxa" w:w="90"/>
+            </w:tcMar>
+          </w:tcPr>
+          <w:p>
+            <w:r>
+              <w:rPr>
+                <w:b w:val="false"/>
+                <w:bCs w:val="false"/>
+                <w:sz w:val="19"/>
+                <w:szCs w:val="19"/>
+              </w:rPr>
+              <w:t xml:space="preserve">Aprobar la secuencia en dos fases</w:t>
+            </w:r>
+          </w:p>
+        </w:tc>
+        <w:tc>
+          <w:tcPr>
+            <w:tcW w:type="dxa" w:w="3500"/>
+            <w:shd w:fill="E6F4EA" w:val="clear"/>
+            <w:tcMar>
+              <w:top w:type="dxa" w:w="70"/>
+              <w:left w:type="dxa" w:w="90"/>
+              <w:bottom w:type="dxa" w:w="70"/>
+              <w:right w:type="dxa" w:w="90"/>
+            </w:tcMar>
+          </w:tcPr>
+          <w:p>
+            <w:r>
+              <w:rPr>
+                <w:b w:val="false"/>
+                <w:bCs w:val="false"/>
+                <w:sz w:val="19"/>
+                <w:szCs w:val="19"/>
+              </w:rPr>
+              <w:t xml:space="preserve">Confirmado por Leo y Hernán (15/09)</w:t>
             </w:r>
           </w:p>
         </w:tc>
@@ -884,7 +1155,7 @@
       <w:tr>
         <w:tc>
           <w:tcPr>
-            <w:tcW w:type="dxa" w:w="900"/>
+            <w:tcW w:type="dxa" w:w="700"/>
             <w:tcMar>
               <w:top w:type="dxa" w:w="70"/>
               <w:left w:type="dxa" w:w="90"/>
@@ -906,45 +1177,45 @@
         </w:tc>
         <w:tc>
           <w:tcPr>
-            <w:tcW w:type="dxa" w:w="5750"/>
-            <w:tcMar>
-              <w:top w:type="dxa" w:w="70"/>
-              <w:left w:type="dxa" w:w="90"/>
-              <w:bottom w:type="dxa" w:w="70"/>
-              <w:right w:type="dxa" w:w="90"/>
-            </w:tcMar>
-          </w:tcPr>
-          <w:p>
-            <w:r>
-              <w:rPr>
-                <w:b w:val="false"/>
-                <w:bCs w:val="false"/>
-                <w:sz w:val="19"/>
-                <w:szCs w:val="19"/>
-              </w:rPr>
-              <w:t xml:space="preserve">Elegir proveedor de geocoding para la Fase 2</w:t>
-            </w:r>
-          </w:p>
-        </w:tc>
-        <w:tc>
-          <w:tcPr>
-            <w:tcW w:type="dxa" w:w="2700"/>
-            <w:tcMar>
-              <w:top w:type="dxa" w:w="70"/>
-              <w:left w:type="dxa" w:w="90"/>
-              <w:bottom w:type="dxa" w:w="70"/>
-              <w:right w:type="dxa" w:w="90"/>
-            </w:tcMar>
-          </w:tcPr>
-          <w:p>
-            <w:r>
-              <w:rPr>
-                <w:b w:val="false"/>
-                <w:bCs w:val="false"/>
-                <w:sz w:val="19"/>
-                <w:szCs w:val="19"/>
-              </w:rPr>
-              <w:t xml:space="preserve">Hernán Gregorini, Matías Krepchuk</w:t>
+            <w:tcW w:type="dxa" w:w="5150"/>
+            <w:tcMar>
+              <w:top w:type="dxa" w:w="70"/>
+              <w:left w:type="dxa" w:w="90"/>
+              <w:bottom w:type="dxa" w:w="70"/>
+              <w:right w:type="dxa" w:w="90"/>
+            </w:tcMar>
+          </w:tcPr>
+          <w:p>
+            <w:r>
+              <w:rPr>
+                <w:b w:val="false"/>
+                <w:bCs w:val="false"/>
+                <w:sz w:val="19"/>
+                <w:szCs w:val="19"/>
+              </w:rPr>
+              <w:t xml:space="preserve">Elegir proveedor de geocoding (Google vs. Nominatim)</w:t>
+            </w:r>
+          </w:p>
+        </w:tc>
+        <w:tc>
+          <w:tcPr>
+            <w:tcW w:type="dxa" w:w="3500"/>
+            <w:tcMar>
+              <w:top w:type="dxa" w:w="70"/>
+              <w:left w:type="dxa" w:w="90"/>
+              <w:bottom w:type="dxa" w:w="70"/>
+              <w:right w:type="dxa" w:w="90"/>
+            </w:tcMar>
+          </w:tcPr>
+          <w:p>
+            <w:r>
+              <w:rPr>
+                <w:b w:val="false"/>
+                <w:bCs w:val="false"/>
+                <w:sz w:val="19"/>
+                <w:szCs w:val="19"/>
+              </w:rPr>
+              <w:t xml:space="preserve">En discusión — recomendación: Google (§5)</w:t>
             </w:r>
           </w:p>
         </w:tc>
@@ -952,7 +1223,7 @@
       <w:tr>
         <w:tc>
           <w:tcPr>
-            <w:tcW w:type="dxa" w:w="900"/>
+            <w:tcW w:type="dxa" w:w="700"/>
             <w:tcMar>
               <w:top w:type="dxa" w:w="70"/>
               <w:left w:type="dxa" w:w="90"/>
@@ -974,45 +1245,45 @@
         </w:tc>
         <w:tc>
           <w:tcPr>
-            <w:tcW w:type="dxa" w:w="5750"/>
-            <w:tcMar>
-              <w:top w:type="dxa" w:w="70"/>
-              <w:left w:type="dxa" w:w="90"/>
-              <w:bottom w:type="dxa" w:w="70"/>
-              <w:right w:type="dxa" w:w="90"/>
-            </w:tcMar>
-          </w:tcPr>
-          <w:p>
-            <w:r>
-              <w:rPr>
-                <w:b w:val="false"/>
-                <w:bCs w:val="false"/>
-                <w:sz w:val="19"/>
-                <w:szCs w:val="19"/>
-              </w:rPr>
-              <w:t xml:space="preserve">Corregir el duplicado de "Avellaneda" en localities antes de la Fase 2</w:t>
-            </w:r>
-          </w:p>
-        </w:tc>
-        <w:tc>
-          <w:tcPr>
-            <w:tcW w:type="dxa" w:w="2700"/>
-            <w:tcMar>
-              <w:top w:type="dxa" w:w="70"/>
-              <w:left w:type="dxa" w:w="90"/>
-              <w:bottom w:type="dxa" w:w="70"/>
-              <w:right w:type="dxa" w:w="90"/>
-            </w:tcMar>
-          </w:tcPr>
-          <w:p>
-            <w:r>
-              <w:rPr>
-                <w:b w:val="false"/>
-                <w:bCs w:val="false"/>
-                <w:sz w:val="19"/>
-                <w:szCs w:val="19"/>
-              </w:rPr>
-              <w:t xml:space="preserve">Hernán Gregorini</w:t>
+            <w:tcW w:type="dxa" w:w="5150"/>
+            <w:tcMar>
+              <w:top w:type="dxa" w:w="70"/>
+              <w:left w:type="dxa" w:w="90"/>
+              <w:bottom w:type="dxa" w:w="70"/>
+              <w:right w:type="dxa" w:w="90"/>
+            </w:tcMar>
+          </w:tcPr>
+          <w:p>
+            <w:r>
+              <w:rPr>
+                <w:b w:val="false"/>
+                <w:bCs w:val="false"/>
+                <w:sz w:val="19"/>
+                <w:szCs w:val="19"/>
+              </w:rPr>
+              <w:t xml:space="preserve">Corregir el duplicado de "Avellaneda" antes de la Fase 2</w:t>
+            </w:r>
+          </w:p>
+        </w:tc>
+        <w:tc>
+          <w:tcPr>
+            <w:tcW w:type="dxa" w:w="3500"/>
+            <w:tcMar>
+              <w:top w:type="dxa" w:w="70"/>
+              <w:left w:type="dxa" w:w="90"/>
+              <w:bottom w:type="dxa" w:w="70"/>
+              <w:right w:type="dxa" w:w="90"/>
+            </w:tcMar>
+          </w:tcPr>
+          <w:p>
+            <w:r>
+              <w:rPr>
+                <w:b w:val="false"/>
+                <w:bCs w:val="false"/>
+                <w:sz w:val="19"/>
+                <w:szCs w:val="19"/>
+              </w:rPr>
+              <w:t xml:space="preserve">Pendiente — Hernán</w:t>
             </w:r>
           </w:p>
         </w:tc>
@@ -1020,7 +1291,7 @@
       <w:tr>
         <w:tc>
           <w:tcPr>
-            <w:tcW w:type="dxa" w:w="900"/>
+            <w:tcW w:type="dxa" w:w="700"/>
             <w:tcMar>
               <w:top w:type="dxa" w:w="70"/>
               <w:left w:type="dxa" w:w="90"/>
@@ -1042,45 +1313,339 @@
         </w:tc>
         <w:tc>
           <w:tcPr>
-            <w:tcW w:type="dxa" w:w="5750"/>
-            <w:tcMar>
-              <w:top w:type="dxa" w:w="70"/>
-              <w:left w:type="dxa" w:w="90"/>
-              <w:bottom w:type="dxa" w:w="70"/>
-              <w:right w:type="dxa" w:w="90"/>
-            </w:tcMar>
-          </w:tcPr>
-          <w:p>
-            <w:r>
-              <w:rPr>
-                <w:b w:val="false"/>
-                <w:bCs w:val="false"/>
-                <w:sz w:val="19"/>
-                <w:szCs w:val="19"/>
-              </w:rPr>
-              <w:t xml:space="preserve">Definir el criterio exacto de "cuándo cae al fallback" en la Fase 2</w:t>
-            </w:r>
-          </w:p>
-        </w:tc>
-        <w:tc>
-          <w:tcPr>
-            <w:tcW w:type="dxa" w:w="2700"/>
-            <w:tcMar>
-              <w:top w:type="dxa" w:w="70"/>
-              <w:left w:type="dxa" w:w="90"/>
-              <w:bottom w:type="dxa" w:w="70"/>
-              <w:right w:type="dxa" w:w="90"/>
-            </w:tcMar>
-          </w:tcPr>
-          <w:p>
-            <w:r>
-              <w:rPr>
-                <w:b w:val="false"/>
-                <w:bCs w:val="false"/>
-                <w:sz w:val="19"/>
-                <w:szCs w:val="19"/>
-              </w:rPr>
-              <w:t xml:space="preserve">Hernán Gregorini, Leonel Nuñez</w:t>
+            <w:tcW w:type="dxa" w:w="5150"/>
+            <w:tcMar>
+              <w:top w:type="dxa" w:w="70"/>
+              <w:left w:type="dxa" w:w="90"/>
+              <w:bottom w:type="dxa" w:w="70"/>
+              <w:right w:type="dxa" w:w="90"/>
+            </w:tcMar>
+          </w:tcPr>
+          <w:p>
+            <w:r>
+              <w:rPr>
+                <w:b w:val="false"/>
+                <w:bCs w:val="false"/>
+                <w:sz w:val="19"/>
+                <w:szCs w:val="19"/>
+              </w:rPr>
+              <w:t xml:space="preserve">Definir el criterio de "cuándo cae al fallback"</w:t>
+            </w:r>
+          </w:p>
+        </w:tc>
+        <w:tc>
+          <w:tcPr>
+            <w:tcW w:type="dxa" w:w="3500"/>
+            <w:tcMar>
+              <w:top w:type="dxa" w:w="70"/>
+              <w:left w:type="dxa" w:w="90"/>
+              <w:bottom w:type="dxa" w:w="70"/>
+              <w:right w:type="dxa" w:w="90"/>
+            </w:tcMar>
+          </w:tcPr>
+          <w:p>
+            <w:r>
+              <w:rPr>
+                <w:b w:val="false"/>
+                <w:bCs w:val="false"/>
+                <w:sz w:val="19"/>
+                <w:szCs w:val="19"/>
+              </w:rPr>
+              <w:t xml:space="preserve">Pendiente — Hernán, Leonel</w:t>
+            </w:r>
+          </w:p>
+        </w:tc>
+      </w:tr>
+      <w:tr>
+        <w:tc>
+          <w:tcPr>
+            <w:tcW w:type="dxa" w:w="700"/>
+            <w:tcMar>
+              <w:top w:type="dxa" w:w="70"/>
+              <w:left w:type="dxa" w:w="90"/>
+              <w:bottom w:type="dxa" w:w="70"/>
+              <w:right w:type="dxa" w:w="90"/>
+            </w:tcMar>
+          </w:tcPr>
+          <w:p>
+            <w:r>
+              <w:rPr>
+                <w:b w:val="false"/>
+                <w:bCs w:val="false"/>
+                <w:sz w:val="19"/>
+                <w:szCs w:val="19"/>
+              </w:rPr>
+              <w:t xml:space="preserve">O-5</w:t>
+            </w:r>
+          </w:p>
+        </w:tc>
+        <w:tc>
+          <w:tcPr>
+            <w:tcW w:type="dxa" w:w="5150"/>
+            <w:tcMar>
+              <w:top w:type="dxa" w:w="70"/>
+              <w:left w:type="dxa" w:w="90"/>
+              <w:bottom w:type="dxa" w:w="70"/>
+              <w:right w:type="dxa" w:w="90"/>
+            </w:tcMar>
+          </w:tcPr>
+          <w:p>
+            <w:r>
+              <w:rPr>
+                <w:b w:val="false"/>
+                <w:bCs w:val="false"/>
+                <w:sz w:val="19"/>
+                <w:szCs w:val="19"/>
+              </w:rPr>
+              <w:t xml:space="preserve">Armar la HU con subtareas para la Fase 2</w:t>
+            </w:r>
+          </w:p>
+        </w:tc>
+        <w:tc>
+          <w:tcPr>
+            <w:tcW w:type="dxa" w:w="3500"/>
+            <w:tcMar>
+              <w:top w:type="dxa" w:w="70"/>
+              <w:left w:type="dxa" w:w="90"/>
+              <w:bottom w:type="dxa" w:w="70"/>
+              <w:right w:type="dxa" w:w="90"/>
+            </w:tcMar>
+          </w:tcPr>
+          <w:p>
+            <w:r>
+              <w:rPr>
+                <w:b w:val="false"/>
+                <w:bCs w:val="false"/>
+                <w:sz w:val="19"/>
+                <w:szCs w:val="19"/>
+              </w:rPr>
+              <w:t xml:space="preserve">Pendiente — Matías</w:t>
+            </w:r>
+          </w:p>
+        </w:tc>
+      </w:tr>
+    </w:tbl>
+    <w:p>
+      <w:pPr>
+        <w:pStyle w:val="Heading1"/>
+        <w:spacing w:after="120" w:before="260"/>
+      </w:pPr>
+      <w:r>
+        <w:t xml:space="preserve">Nota de versión</w:t>
+      </w:r>
+    </w:p>
+    <w:p>
+      <w:pPr>
+        <w:spacing w:after="120" w:before="100"/>
+      </w:pPr>
+      <w:r>
+        <w:rPr>
+          <w:b/>
+          <w:bCs/>
+          <w:sz w:val="21"/>
+          <w:szCs w:val="21"/>
+        </w:rPr>
+        <w:t xml:space="preserve">v1.2 — 15 de septiembre de 2026</w:t>
+      </w:r>
+    </w:p>
+    <w:tbl>
+      <w:tblPr>
+        <w:tblW w:type="dxa" w:w="9350"/>
+        <w:tblBorders>
+          <w:top w:val="single" w:color="auto" w:sz="4"/>
+          <w:left w:val="single" w:color="auto" w:sz="4"/>
+          <w:bottom w:val="single" w:color="auto" w:sz="4"/>
+          <w:right w:val="single" w:color="auto" w:sz="4"/>
+          <w:insideH w:val="single" w:color="auto" w:sz="4"/>
+          <w:insideV w:val="single" w:color="auto" w:sz="4"/>
+        </w:tblBorders>
+      </w:tblPr>
+      <w:tblGrid>
+        <w:gridCol w:w="4200"/>
+        <w:gridCol w:w="5150"/>
+      </w:tblGrid>
+      <w:tr>
+        <w:tc>
+          <w:tcPr>
+            <w:tcW w:type="dxa" w:w="4200"/>
+            <w:shd w:fill="D9E2F3" w:val="clear"/>
+            <w:tcMar>
+              <w:top w:type="dxa" w:w="70"/>
+              <w:left w:type="dxa" w:w="90"/>
+              <w:bottom w:type="dxa" w:w="70"/>
+              <w:right w:type="dxa" w:w="90"/>
+            </w:tcMar>
+          </w:tcPr>
+          <w:p>
+            <w:r>
+              <w:rPr>
+                <w:b/>
+                <w:bCs/>
+                <w:sz w:val="19"/>
+                <w:szCs w:val="19"/>
+              </w:rPr>
+              <w:t xml:space="preserve">Qué cambió</w:t>
+            </w:r>
+          </w:p>
+        </w:tc>
+        <w:tc>
+          <w:tcPr>
+            <w:tcW w:type="dxa" w:w="5150"/>
+            <w:shd w:fill="D9E2F3" w:val="clear"/>
+            <w:tcMar>
+              <w:top w:type="dxa" w:w="70"/>
+              <w:left w:type="dxa" w:w="90"/>
+              <w:bottom w:type="dxa" w:w="70"/>
+              <w:right w:type="dxa" w:w="90"/>
+            </w:tcMar>
+          </w:tcPr>
+          <w:p>
+            <w:r>
+              <w:rPr>
+                <w:b/>
+                <w:bCs/>
+                <w:sz w:val="19"/>
+                <w:szCs w:val="19"/>
+              </w:rPr>
+              <w:t xml:space="preserve">Por qué</w:t>
+            </w:r>
+          </w:p>
+        </w:tc>
+      </w:tr>
+      <w:tr>
+        <w:tc>
+          <w:tcPr>
+            <w:tcW w:type="dxa" w:w="4200"/>
+            <w:tcMar>
+              <w:top w:type="dxa" w:w="70"/>
+              <w:left w:type="dxa" w:w="90"/>
+              <w:bottom w:type="dxa" w:w="70"/>
+              <w:right w:type="dxa" w:w="90"/>
+            </w:tcMar>
+          </w:tcPr>
+          <w:p>
+            <w:r>
+              <w:rPr>
+                <w:b w:val="false"/>
+                <w:bCs w:val="false"/>
+                <w:sz w:val="19"/>
+                <w:szCs w:val="19"/>
+              </w:rPr>
+              <w:t xml:space="preserve">Comparación Google vs. Nominatim (§5)</w:t>
+            </w:r>
+          </w:p>
+        </w:tc>
+        <w:tc>
+          <w:tcPr>
+            <w:tcW w:type="dxa" w:w="5150"/>
+            <w:tcMar>
+              <w:top w:type="dxa" w:w="70"/>
+              <w:left w:type="dxa" w:w="90"/>
+              <w:bottom w:type="dxa" w:w="70"/>
+              <w:right w:type="dxa" w:w="90"/>
+            </w:tcMar>
+          </w:tcPr>
+          <w:p>
+            <w:r>
+              <w:rPr>
+                <w:b w:val="false"/>
+                <w:bCs w:val="false"/>
+                <w:sz w:val="19"/>
+                <w:szCs w:val="19"/>
+              </w:rPr>
+              <w:t xml:space="preserve">Leo y Hernán propusieron proveedores distintos en Jira</w:t>
+            </w:r>
+          </w:p>
+        </w:tc>
+      </w:tr>
+      <w:tr>
+        <w:tc>
+          <w:tcPr>
+            <w:tcW w:type="dxa" w:w="4200"/>
+            <w:tcMar>
+              <w:top w:type="dxa" w:w="70"/>
+              <w:left w:type="dxa" w:w="90"/>
+              <w:bottom w:type="dxa" w:w="70"/>
+              <w:right w:type="dxa" w:w="90"/>
+            </w:tcMar>
+          </w:tcPr>
+          <w:p>
+            <w:r>
+              <w:rPr>
+                <w:b w:val="false"/>
+                <w:bCs w:val="false"/>
+                <w:sz w:val="19"/>
+                <w:szCs w:val="19"/>
+              </w:rPr>
+              <w:t xml:space="preserve">O-1 confirmado</w:t>
+            </w:r>
+          </w:p>
+        </w:tc>
+        <w:tc>
+          <w:tcPr>
+            <w:tcW w:type="dxa" w:w="5150"/>
+            <w:tcMar>
+              <w:top w:type="dxa" w:w="70"/>
+              <w:left w:type="dxa" w:w="90"/>
+              <w:bottom w:type="dxa" w:w="70"/>
+              <w:right w:type="dxa" w:w="90"/>
+            </w:tcMar>
+          </w:tcPr>
+          <w:p>
+            <w:r>
+              <w:rPr>
+                <w:b w:val="false"/>
+                <w:bCs w:val="false"/>
+                <w:sz w:val="19"/>
+                <w:szCs w:val="19"/>
+              </w:rPr>
+              <w:t xml:space="preserve">Ambos coincidieron con la secuencia de dos fases</w:t>
+            </w:r>
+          </w:p>
+        </w:tc>
+      </w:tr>
+      <w:tr>
+        <w:tc>
+          <w:tcPr>
+            <w:tcW w:type="dxa" w:w="4200"/>
+            <w:tcMar>
+              <w:top w:type="dxa" w:w="70"/>
+              <w:left w:type="dxa" w:w="90"/>
+              <w:bottom w:type="dxa" w:w="70"/>
+              <w:right w:type="dxa" w:w="90"/>
+            </w:tcMar>
+          </w:tcPr>
+          <w:p>
+            <w:r>
+              <w:rPr>
+                <w:b w:val="false"/>
+                <w:bCs w:val="false"/>
+                <w:sz w:val="19"/>
+                <w:szCs w:val="19"/>
+              </w:rPr>
+              <w:t xml:space="preserve">Se agregó §4 (fuera de alcance)</w:t>
+            </w:r>
+          </w:p>
+        </w:tc>
+        <w:tc>
+          <w:tcPr>
+            <w:tcW w:type="dxa" w:w="5150"/>
+            <w:tcMar>
+              <w:top w:type="dxa" w:w="70"/>
+              <w:left w:type="dxa" w:w="90"/>
+              <w:bottom w:type="dxa" w:w="70"/>
+              <w:right w:type="dxa" w:w="90"/>
+            </w:tcMar>
+          </w:tcPr>
+          <w:p>
+            <w:r>
+              <w:rPr>
+                <w:b w:val="false"/>
+                <w:bCs w:val="false"/>
+                <w:sz w:val="19"/>
+                <w:szCs w:val="19"/>
+              </w:rPr>
+              <w:t xml:space="preserve">Leo pidió priorizar el frente RAG este sprint</w:t>
             </w:r>
           </w:p>
         </w:tc>
@@ -1101,7 +1666,7 @@
         </w:rPr>
         <w:t xml:space="preserve">Documentos relacionados: </w:t>
       </w:r>
-      <w:hyperlink w:history="1" r:id="rIdcmoxqmikxixhxgpkutkyy">
+      <w:hyperlink w:history="1" r:id="rIdjze9k1hhkfaahewpiuuzm">
         <w:r>
           <w:rPr>
             <w:rStyle w:val="Hyperlink"/>
@@ -1116,7 +1681,7 @@
           <w:sz w:val="20"/>
           <w:szCs w:val="20"/>
         </w:rPr>
-        <w:t xml:space="preserve"> · REP-2500_resolucion-locality-id.docx (v1.0, 14/09)</w:t>
+        <w:t xml:space="preserve"> · REP-2500_resolucion-locality-id.docx (v1.0, 14/09) · REP-2908-VERIF_devolucion-a-hernan.docx</w:t>
       </w:r>
     </w:p>
     <w:sectPr>
@@ -1307,6 +1872,12 @@
   </w:abstractNum>
   <w:num w:numId="1">
     <w:abstractNumId w:val="1"/>
+    <w:lvlOverride w:ilvl="0">
+      <w:startOverride w:val="1"/>
+    </w:lvlOverride>
+  </w:num>
+  <w:num w:numId="2">
+    <w:abstractNumId w:val="2"/>
     <w:lvlOverride w:ilvl="0">
       <w:startOverride w:val="1"/>
     </w:lvlOverride>

</xml_diff>